<commit_message>
chore: update estimate template placeholders for improved document formatting
</commit_message>
<xml_diff>
--- a/estimate_perday_template.docx
+++ b/estimate_perday_template.docx
@@ -230,19 +230,17 @@
     <w:tbl>
       <w:tblPr>
         <w:tblStyle w:val="Tablaconcuadrcula"/>
-        <w:tblW w:w="10530" w:type="dxa"/>
-        <w:tblInd w:w="-810" w:type="dxa"/>
-        <w:tblLayout w:type="fixed"/>
+        <w:tblW w:w="5000" w:type="pct"/>
         <w:tblLook w:val="04A0" w:firstRow="1" w:lastRow="0" w:firstColumn="1" w:lastColumn="0" w:noHBand="0" w:noVBand="1"/>
       </w:tblPr>
       <w:tblGrid>
-        <w:gridCol w:w="3294"/>
-        <w:gridCol w:w="7236"/>
+        <w:gridCol w:w="2616"/>
+        <w:gridCol w:w="6960"/>
       </w:tblGrid>
       <w:tr>
         <w:tc>
           <w:tcPr>
-            <w:tcW w:w="3294" w:type="dxa"/>
+            <w:tcW w:w="1311" w:type="pct"/>
             <w:tcBorders>
               <w:top w:val="nil"/>
               <w:left w:val="nil"/>
@@ -282,156 +280,228 @@
               <w:spacing w:after="0" w:line="0" w:lineRule="atLeast"/>
               <w:rPr>
                 <w:rFonts w:ascii="Open Sans" w:hAnsi="Open Sans" w:cs="Open Sans"/>
+                <w:sz w:val="18"/>
+                <w:szCs w:val="18"/>
+                <w:lang w:val="en-US"/>
+              </w:rPr>
+            </w:pPr>
+            <w:r>
+              <w:rPr>
+                <w:rFonts w:ascii="Open Sans" w:eastAsia="Aptos" w:hAnsi="Open Sans" w:cs="Open Sans"/>
                 <w:b/>
                 <w:i/>
                 <w:color w:val="612D4B"/>
-                <w:sz w:val="26"/>
-                <w:lang w:val="en-US"/>
-              </w:rPr>
-            </w:pPr>
-          </w:p>
-          <w:p>
-            <w:pPr>
-              <w:spacing w:after="0" w:line="0" w:lineRule="atLeast"/>
-              <w:rPr>
-                <w:rFonts w:ascii="Open Sans" w:hAnsi="Open Sans" w:cs="Open Sans"/>
-                <w:sz w:val="18"/>
-                <w:szCs w:val="18"/>
-                <w:lang w:val="en-US"/>
-              </w:rPr>
-            </w:pPr>
-            <w:r>
-              <w:rPr>
-                <w:rFonts w:ascii="Open Sans" w:eastAsia="Aptos" w:hAnsi="Open Sans" w:cs="Open Sans"/>
-                <w:b/>
-                <w:i/>
+                <w:sz w:val="18"/>
+                <w:szCs w:val="18"/>
+                <w:lang w:val="en-US"/>
+              </w:rPr>
+              <w:t>We create everlasting moments</w:t>
+            </w:r>
+          </w:p>
+          <w:p>
+            <w:pPr>
+              <w:spacing w:after="0" w:line="0" w:lineRule="atLeast"/>
+              <w:rPr>
+                <w:rFonts w:ascii="Open Sans" w:hAnsi="Open Sans" w:cs="Open Sans"/>
+                <w:sz w:val="18"/>
+                <w:szCs w:val="18"/>
+                <w:lang w:val="en-US"/>
+              </w:rPr>
+            </w:pPr>
+          </w:p>
+          <w:p>
+            <w:pPr>
+              <w:spacing w:after="0" w:line="0" w:lineRule="atLeast"/>
+              <w:rPr>
+                <w:rFonts w:ascii="Open Sans" w:hAnsi="Open Sans" w:cs="Open Sans"/>
+                <w:sz w:val="18"/>
+                <w:szCs w:val="18"/>
+                <w:lang w:val="en-US"/>
+              </w:rPr>
+            </w:pPr>
+            <w:r>
+              <w:rPr>
+                <w:rFonts w:ascii="Open Sans" w:eastAsia="Aptos" w:hAnsi="Open Sans" w:cs="Open Sans"/>
+                <w:b/>
                 <w:color w:val="612D4B"/>
                 <w:sz w:val="18"/>
                 <w:szCs w:val="18"/>
                 <w:lang w:val="en-US"/>
               </w:rPr>
-              <w:t>We create everlasting moments</w:t>
-            </w:r>
-          </w:p>
-          <w:p>
-            <w:pPr>
-              <w:spacing w:after="0" w:line="0" w:lineRule="atLeast"/>
-              <w:rPr>
-                <w:rFonts w:ascii="Open Sans" w:hAnsi="Open Sans" w:cs="Open Sans"/>
-                <w:sz w:val="18"/>
-                <w:szCs w:val="18"/>
-                <w:lang w:val="en-US"/>
-              </w:rPr>
-            </w:pPr>
-          </w:p>
-          <w:p>
-            <w:pPr>
-              <w:spacing w:after="0" w:line="0" w:lineRule="atLeast"/>
-              <w:rPr>
-                <w:rFonts w:ascii="Open Sans" w:hAnsi="Open Sans" w:cs="Open Sans"/>
-                <w:sz w:val="18"/>
-                <w:szCs w:val="18"/>
-                <w:lang w:val="en-US"/>
-              </w:rPr>
-            </w:pPr>
-            <w:r>
-              <w:rPr>
-                <w:rFonts w:ascii="Open Sans" w:eastAsia="Aptos" w:hAnsi="Open Sans" w:cs="Open Sans"/>
+              <w:t>Client</w:t>
+            </w:r>
+          </w:p>
+          <w:p>
+            <w:pPr>
+              <w:spacing w:after="0" w:line="0" w:lineRule="atLeast"/>
+              <w:rPr>
+                <w:rFonts w:ascii="Open Sans" w:hAnsi="Open Sans" w:cs="Open Sans"/>
+                <w:color w:val="000000"/>
+                <w:sz w:val="18"/>
+                <w:szCs w:val="18"/>
+                <w:lang w:val="en-US"/>
+              </w:rPr>
+            </w:pPr>
+            <w:r>
+              <w:rPr>
+                <w:rFonts w:ascii="Open Sans" w:eastAsia="Aptos" w:hAnsi="Open Sans" w:cs="Open Sans"/>
+                <w:color w:val="000000"/>
+                <w:sz w:val="18"/>
+                <w:szCs w:val="18"/>
+                <w:lang w:val="en-US"/>
+              </w:rPr>
+              <w:t>{{CLIENT_NAME}}</w:t>
+            </w:r>
+          </w:p>
+          <w:p>
+            <w:pPr>
+              <w:spacing w:after="0" w:line="0" w:lineRule="atLeast"/>
+              <w:rPr>
+                <w:rFonts w:ascii="Open Sans" w:hAnsi="Open Sans" w:cs="Open Sans"/>
+                <w:sz w:val="18"/>
+                <w:szCs w:val="18"/>
+                <w:lang w:val="en-US"/>
+              </w:rPr>
+            </w:pPr>
+            <w:r>
+              <w:rPr>
+                <w:rFonts w:ascii="Open Sans" w:eastAsia="Aptos" w:hAnsi="Open Sans" w:cs="Open Sans"/>
+                <w:sz w:val="18"/>
+                <w:szCs w:val="18"/>
+                <w:lang w:val="en-US"/>
+              </w:rPr>
+              <w:t>{{CLIENT_ADDRESS}}</w:t>
+            </w:r>
+          </w:p>
+          <w:p>
+            <w:pPr>
+              <w:spacing w:after="0" w:line="0" w:lineRule="atLeast"/>
+              <w:rPr>
+                <w:rFonts w:ascii="Open Sans" w:hAnsi="Open Sans" w:cs="Open Sans"/>
+                <w:sz w:val="18"/>
+                <w:szCs w:val="18"/>
+                <w:lang w:val="en-US"/>
+              </w:rPr>
+            </w:pPr>
+            <w:r>
+              <w:rPr>
+                <w:rFonts w:ascii="Open Sans" w:eastAsia="Aptos" w:hAnsi="Open Sans" w:cs="Open Sans"/>
+                <w:sz w:val="18"/>
+                <w:szCs w:val="18"/>
+                <w:lang w:val="en-US"/>
+              </w:rPr>
+              <w:t>{{CLIENT_EMAIL}}</w:t>
+            </w:r>
+          </w:p>
+          <w:p>
+            <w:pPr>
+              <w:spacing w:after="0" w:line="0" w:lineRule="atLeast"/>
+              <w:rPr>
+                <w:rFonts w:ascii="Open Sans" w:hAnsi="Open Sans" w:cs="Open Sans"/>
+                <w:sz w:val="18"/>
+                <w:szCs w:val="18"/>
+                <w:lang w:val="en-US"/>
+              </w:rPr>
+            </w:pPr>
+          </w:p>
+          <w:p>
+            <w:pPr>
+              <w:spacing w:after="0" w:line="0" w:lineRule="atLeast"/>
+              <w:rPr>
+                <w:rFonts w:ascii="Open Sans" w:hAnsi="Open Sans" w:cs="Open Sans"/>
                 <w:b/>
                 <w:color w:val="612D4B"/>
                 <w:sz w:val="18"/>
                 <w:szCs w:val="18"/>
                 <w:lang w:val="en-US"/>
               </w:rPr>
-              <w:t>Client</w:t>
-            </w:r>
-          </w:p>
-          <w:p>
-            <w:pPr>
-              <w:spacing w:after="0" w:line="0" w:lineRule="atLeast"/>
-              <w:rPr>
-                <w:rFonts w:ascii="Open Sans" w:hAnsi="Open Sans" w:cs="Open Sans"/>
-                <w:color w:val="000000"/>
-                <w:sz w:val="18"/>
-                <w:szCs w:val="18"/>
-                <w:lang w:val="en-US"/>
-              </w:rPr>
-            </w:pPr>
-            <w:r>
-              <w:rPr>
-                <w:rFonts w:ascii="Open Sans" w:eastAsia="Aptos" w:hAnsi="Open Sans" w:cs="Open Sans"/>
-                <w:color w:val="000000"/>
-                <w:sz w:val="18"/>
-                <w:szCs w:val="18"/>
-                <w:lang w:val="en-US"/>
-              </w:rPr>
-              <w:t>{{CLIENT_NAME}}</w:t>
-            </w:r>
-          </w:p>
-          <w:p>
-            <w:pPr>
-              <w:spacing w:after="0" w:line="0" w:lineRule="atLeast"/>
-              <w:rPr>
-                <w:rFonts w:ascii="Open Sans" w:hAnsi="Open Sans" w:cs="Open Sans"/>
-                <w:sz w:val="18"/>
-                <w:szCs w:val="18"/>
-                <w:lang w:val="en-US"/>
-              </w:rPr>
-            </w:pPr>
-            <w:r>
-              <w:rPr>
-                <w:rFonts w:ascii="Open Sans" w:eastAsia="Aptos" w:hAnsi="Open Sans" w:cs="Open Sans"/>
-                <w:sz w:val="18"/>
-                <w:szCs w:val="18"/>
-                <w:lang w:val="en-US"/>
-              </w:rPr>
-              <w:t>{{CLIENT_ADDRESS}}</w:t>
-            </w:r>
-          </w:p>
-          <w:p>
-            <w:pPr>
-              <w:spacing w:after="0" w:line="0" w:lineRule="atLeast"/>
-              <w:rPr>
-                <w:rFonts w:ascii="Open Sans" w:hAnsi="Open Sans" w:cs="Open Sans"/>
-                <w:sz w:val="18"/>
-                <w:szCs w:val="18"/>
-                <w:lang w:val="en-US"/>
-              </w:rPr>
-            </w:pPr>
-            <w:r>
-              <w:rPr>
-                <w:rFonts w:ascii="Open Sans" w:eastAsia="Aptos" w:hAnsi="Open Sans" w:cs="Open Sans"/>
-                <w:sz w:val="18"/>
-                <w:szCs w:val="18"/>
-                <w:lang w:val="en-US"/>
-              </w:rPr>
-              <w:t>{{CLIENT_EMAIL}}</w:t>
-            </w:r>
-          </w:p>
-          <w:p>
-            <w:pPr>
-              <w:spacing w:after="0" w:line="0" w:lineRule="atLeast"/>
-              <w:rPr>
-                <w:rFonts w:ascii="Open Sans" w:hAnsi="Open Sans" w:cs="Open Sans"/>
-                <w:sz w:val="18"/>
-                <w:szCs w:val="18"/>
-                <w:lang w:val="en-US"/>
-              </w:rPr>
-            </w:pPr>
-          </w:p>
-          <w:p>
-            <w:pPr>
-              <w:spacing w:after="0" w:line="0" w:lineRule="atLeast"/>
-              <w:rPr>
-                <w:rFonts w:ascii="Open Sans" w:hAnsi="Open Sans" w:cs="Open Sans"/>
+            </w:pPr>
+            <w:r>
+              <w:rPr>
+                <w:rFonts w:ascii="Open Sans" w:eastAsia="Aptos" w:hAnsi="Open Sans" w:cs="Open Sans"/>
                 <w:b/>
                 <w:color w:val="612D4B"/>
                 <w:sz w:val="18"/>
                 <w:szCs w:val="18"/>
                 <w:lang w:val="en-US"/>
               </w:rPr>
-            </w:pPr>
-            <w:r>
+              <w:t>Client Representative</w:t>
+            </w:r>
+          </w:p>
+          <w:p>
+            <w:pPr>
+              <w:spacing w:after="0" w:line="0" w:lineRule="atLeast"/>
+              <w:rPr>
+                <w:rFonts w:ascii="Open Sans" w:hAnsi="Open Sans" w:cs="Open Sans"/>
+                <w:sz w:val="18"/>
+                <w:szCs w:val="18"/>
+                <w:lang w:val="en-US"/>
+              </w:rPr>
+            </w:pPr>
+            <w:r>
+              <w:rPr>
+                <w:rFonts w:ascii="Open Sans" w:eastAsia="Aptos" w:hAnsi="Open Sans" w:cs="Open Sans"/>
+                <w:sz w:val="18"/>
+                <w:szCs w:val="18"/>
+                <w:lang w:val="en-US"/>
+              </w:rPr>
+              <w:t>{{REPRESENTATIVE_NAME}}</w:t>
+            </w:r>
+          </w:p>
+          <w:p>
+            <w:pPr>
+              <w:spacing w:after="0" w:line="0" w:lineRule="atLeast"/>
+              <w:rPr>
+                <w:rFonts w:ascii="Open Sans" w:hAnsi="Open Sans" w:cs="Open Sans"/>
+                <w:sz w:val="18"/>
+                <w:szCs w:val="18"/>
+                <w:lang w:val="en-US"/>
+              </w:rPr>
+            </w:pPr>
+            <w:r>
+              <w:rPr>
+                <w:rFonts w:ascii="Open Sans" w:eastAsia="Aptos" w:hAnsi="Open Sans" w:cs="Open Sans"/>
+                <w:sz w:val="18"/>
+                <w:szCs w:val="18"/>
+                <w:lang w:val="en-US"/>
+              </w:rPr>
+              <w:t>{{REPRESENTATIVE_EMAIL}}</w:t>
+            </w:r>
+          </w:p>
+          <w:p>
+            <w:pPr>
+              <w:spacing w:after="0" w:line="0" w:lineRule="atLeast"/>
+              <w:rPr>
+                <w:rFonts w:ascii="Open Sans" w:hAnsi="Open Sans" w:cs="Open Sans"/>
+                <w:sz w:val="18"/>
+                <w:szCs w:val="18"/>
+                <w:lang w:val="en-US"/>
+              </w:rPr>
+            </w:pPr>
+            <w:r>
+              <w:rPr>
+                <w:rFonts w:ascii="Open Sans" w:eastAsia="Aptos" w:hAnsi="Open Sans" w:cs="Open Sans"/>
+                <w:sz w:val="18"/>
+                <w:szCs w:val="18"/>
+                <w:lang w:val="en-US"/>
+              </w:rPr>
+              <w:t>Ph: {{REPRESENTATIVE_PHONE}}</w:t>
+            </w:r>
+          </w:p>
+          <w:p>
+            <w:pPr>
+              <w:spacing w:after="0" w:line="0" w:lineRule="atLeast"/>
+              <w:rPr>
+                <w:rFonts w:ascii="Open Sans" w:hAnsi="Open Sans" w:cs="Open Sans"/>
+                <w:sz w:val="18"/>
+                <w:szCs w:val="18"/>
+                <w:lang w:val="en-US"/>
+              </w:rPr>
+            </w:pPr>
+          </w:p>
+          <w:p>
+            <w:pPr>
+              <w:spacing w:after="0" w:line="0" w:lineRule="atLeast"/>
               <w:rPr>
                 <w:rFonts w:ascii="Open Sans" w:eastAsia="Aptos" w:hAnsi="Open Sans" w:cs="Open Sans"/>
                 <w:b/>
@@ -440,83 +510,8 @@
                 <w:szCs w:val="18"/>
                 <w:lang w:val="en-US"/>
               </w:rPr>
-              <w:t>Client Representative</w:t>
-            </w:r>
-          </w:p>
-          <w:p>
-            <w:pPr>
-              <w:spacing w:after="0" w:line="0" w:lineRule="atLeast"/>
-              <w:rPr>
-                <w:rFonts w:ascii="Open Sans" w:hAnsi="Open Sans" w:cs="Open Sans"/>
-                <w:sz w:val="18"/>
-                <w:szCs w:val="18"/>
-                <w:lang w:val="en-US"/>
-              </w:rPr>
-            </w:pPr>
-            <w:r>
-              <w:rPr>
-                <w:rFonts w:ascii="Open Sans" w:eastAsia="Aptos" w:hAnsi="Open Sans" w:cs="Open Sans"/>
-                <w:sz w:val="18"/>
-                <w:szCs w:val="18"/>
-                <w:lang w:val="en-US"/>
-              </w:rPr>
-              <w:t>{{REPRESENTATIVE_NAME}}</w:t>
-            </w:r>
-          </w:p>
-          <w:p>
-            <w:pPr>
-              <w:spacing w:after="0" w:line="0" w:lineRule="atLeast"/>
-              <w:rPr>
-                <w:rFonts w:ascii="Open Sans" w:hAnsi="Open Sans" w:cs="Open Sans"/>
-                <w:sz w:val="18"/>
-                <w:szCs w:val="18"/>
-                <w:lang w:val="en-US"/>
-              </w:rPr>
-            </w:pPr>
-            <w:r>
-              <w:rPr>
-                <w:rFonts w:ascii="Open Sans" w:eastAsia="Aptos" w:hAnsi="Open Sans" w:cs="Open Sans"/>
-                <w:sz w:val="18"/>
-                <w:szCs w:val="18"/>
-                <w:lang w:val="en-US"/>
-              </w:rPr>
-              <w:t>{{REPRESENTATIVE_EMAIL}}</w:t>
-            </w:r>
-          </w:p>
-          <w:p>
-            <w:pPr>
-              <w:spacing w:after="0" w:line="0" w:lineRule="atLeast"/>
-              <w:rPr>
-                <w:rFonts w:ascii="Open Sans" w:hAnsi="Open Sans" w:cs="Open Sans"/>
-                <w:sz w:val="18"/>
-                <w:szCs w:val="18"/>
-                <w:lang w:val="en-US"/>
-              </w:rPr>
-            </w:pPr>
-            <w:r>
-              <w:rPr>
-                <w:rFonts w:ascii="Open Sans" w:eastAsia="Aptos" w:hAnsi="Open Sans" w:cs="Open Sans"/>
-                <w:sz w:val="18"/>
-                <w:szCs w:val="18"/>
-                <w:lang w:val="en-US"/>
-              </w:rPr>
-              <w:t>Ph: {{REPRESENTATIVE_PHONE}}</w:t>
-            </w:r>
-          </w:p>
-          <w:p>
-            <w:pPr>
-              <w:spacing w:after="0" w:line="0" w:lineRule="atLeast"/>
-              <w:rPr>
-                <w:rFonts w:ascii="Open Sans" w:hAnsi="Open Sans" w:cs="Open Sans"/>
-                <w:sz w:val="18"/>
-                <w:szCs w:val="18"/>
-                <w:lang w:val="en-US"/>
-              </w:rPr>
-            </w:pPr>
-          </w:p>
-          <w:p>
-            <w:pPr>
-              <w:spacing w:after="0" w:line="0" w:lineRule="atLeast"/>
+            </w:pPr>
+            <w:r>
               <w:rPr>
                 <w:rFonts w:ascii="Open Sans" w:eastAsia="Aptos" w:hAnsi="Open Sans" w:cs="Open Sans"/>
                 <w:b/>
@@ -525,8 +520,12 @@
                 <w:szCs w:val="18"/>
                 <w:lang w:val="en-US"/>
               </w:rPr>
-            </w:pPr>
-            <w:r>
+              <w:t>Event Details</w:t>
+            </w:r>
+          </w:p>
+          <w:p>
+            <w:pPr>
+              <w:spacing w:after="0" w:line="0" w:lineRule="atLeast"/>
               <w:rPr>
                 <w:rFonts w:ascii="Open Sans" w:eastAsia="Aptos" w:hAnsi="Open Sans" w:cs="Open Sans"/>
                 <w:b/>
@@ -535,47 +534,15 @@
                 <w:szCs w:val="18"/>
                 <w:lang w:val="en-US"/>
               </w:rPr>
-              <w:t>Event Details</w:t>
-            </w:r>
-          </w:p>
-          <w:p>
-            <w:pPr>
-              <w:spacing w:after="0" w:line="0" w:lineRule="atLeast"/>
-              <w:rPr>
-                <w:rFonts w:ascii="Open Sans" w:eastAsia="Aptos" w:hAnsi="Open Sans" w:cs="Open Sans"/>
-                <w:b/>
-                <w:color w:val="612D4B"/>
-                <w:sz w:val="18"/>
-                <w:szCs w:val="18"/>
-                <w:lang w:val="en-US"/>
-              </w:rPr>
-            </w:pPr>
-            <w:r>
-              <w:rPr>
-                <w:rFonts w:ascii="Open Sans" w:eastAsia="Aptos" w:hAnsi="Open Sans" w:cs="Open Sans"/>
-                <w:sz w:val="18"/>
-                <w:szCs w:val="18"/>
-                <w:lang w:val="en-US"/>
-              </w:rPr>
-              <w:t>{{EVENT_</w:t>
-            </w:r>
-            <w:r>
-              <w:rPr>
-                <w:rFonts w:ascii="Open Sans" w:eastAsia="Aptos" w:hAnsi="Open Sans" w:cs="Open Sans"/>
-                <w:sz w:val="18"/>
-                <w:szCs w:val="18"/>
-                <w:lang w:val="en-US"/>
-              </w:rPr>
-              <w:t>NAME</w:t>
-            </w:r>
-            <w:r>
-              <w:rPr>
-                <w:rFonts w:ascii="Open Sans" w:eastAsia="Aptos" w:hAnsi="Open Sans" w:cs="Open Sans"/>
-                <w:sz w:val="18"/>
-                <w:szCs w:val="18"/>
-                <w:lang w:val="en-US"/>
-              </w:rPr>
-              <w:t>}}</w:t>
+            </w:pPr>
+            <w:r>
+              <w:rPr>
+                <w:rFonts w:ascii="Open Sans" w:eastAsia="Aptos" w:hAnsi="Open Sans" w:cs="Open Sans"/>
+                <w:sz w:val="18"/>
+                <w:szCs w:val="18"/>
+                <w:lang w:val="en-US"/>
+              </w:rPr>
+              <w:t>{{EVENT_NAME}}</w:t>
             </w:r>
           </w:p>
           <w:p>
@@ -695,7 +662,7 @@
         </w:tc>
         <w:tc>
           <w:tcPr>
-            <w:tcW w:w="7235" w:type="dxa"/>
+            <w:tcW w:w="3689" w:type="pct"/>
             <w:tcBorders>
               <w:top w:val="nil"/>
               <w:left w:val="nil"/>
@@ -703,17 +670,6 @@
               <w:right w:val="nil"/>
             </w:tcBorders>
           </w:tcPr>
-          <w:p>
-            <w:pPr>
-              <w:spacing w:after="0" w:line="0" w:lineRule="atLeast"/>
-              <w:jc w:val="both"/>
-              <w:rPr>
-                <w:rFonts w:ascii="Open Sans" w:hAnsi="Open Sans" w:cs="Open Sans"/>
-                <w:color w:val="323232"/>
-                <w:lang w:val="en-US"/>
-              </w:rPr>
-            </w:pPr>
-          </w:p>
           <w:p>
             <w:pPr>
               <w:spacing w:after="0" w:line="0" w:lineRule="atLeast"/>
@@ -2686,7 +2642,7 @@
           <wp:extent cx="1122045" cy="793750"/>
           <wp:effectExtent l="0" t="0" r="0" b="0"/>
           <wp:wrapNone/>
-          <wp:docPr id="4" name="Imagen 6" descr="FDC&#10;&#10;El contenido generado por IA puede ser incorrecto."/>
+          <wp:docPr id="1804352181" name="Imagen 6" descr="FDC&#10;&#10;El contenido generado por IA puede ser incorrecto."/>
           <wp:cNvGraphicFramePr>
             <a:graphicFrameLocks xmlns:a="http://schemas.openxmlformats.org/drawingml/2006/main" noChangeAspect="1"/>
           </wp:cNvGraphicFramePr>
@@ -3023,7 +2979,7 @@
               <wp:extent cx="3858260" cy="1271905"/>
               <wp:effectExtent l="0" t="0" r="0" b="5080"/>
               <wp:wrapNone/>
-              <wp:docPr id="2" name="Imagen 3" descr="The image is a colorful abstract representation of spheres in various colors, connected by black lines, arranged in a seemingly random pattern.&#10;&#10;El contenido generado por IA puede ser incorrecto."/>
+              <wp:docPr id="617885518" name="Imagen 3" descr="The image is a colorful abstract representation of spheres in various colors, connected by black lines, arranged in a seemingly random pattern.&#10;&#10;El contenido generado por IA puede ser incorrecto."/>
               <wp:cNvGraphicFramePr/>
               <a:graphic xmlns:a="http://schemas.openxmlformats.org/drawingml/2006/main">
                 <a:graphicData uri="http://schemas.openxmlformats.org/drawingml/2006/picture">

</xml_diff>

<commit_message>
chore: update estimate templates and remove redundant backup files
</commit_message>
<xml_diff>
--- a/estimate_perday_template.docx
+++ b/estimate_perday_template.docx
@@ -235,7 +235,7 @@
       </w:tblPr>
       <w:tblGrid>
         <w:gridCol w:w="2616"/>
-        <w:gridCol w:w="6960"/>
+        <w:gridCol w:w="5102"/>
       </w:tblGrid>
       <w:tr>
         <w:tc>
@@ -699,8 +699,8 @@
               <w:rPr>
                 <w:rFonts w:ascii="Open Sans" w:hAnsi="Open Sans" w:cs="Open Sans"/>
                 <w:color w:val="323232"/>
-                <w:sz w:val="20"/>
-                <w:szCs w:val="20"/>
+                <w:sz w:val="18"/>
+                <w:szCs w:val="18"/>
                 <w:lang w:val="en-US"/>
               </w:rPr>
             </w:pPr>
@@ -708,8 +708,8 @@
               <w:rPr>
                 <w:rFonts w:ascii="Open Sans" w:eastAsia="Aptos" w:hAnsi="Open Sans" w:cs="Open Sans"/>
                 <w:color w:val="323232"/>
-                <w:sz w:val="20"/>
-                <w:szCs w:val="20"/>
+                <w:sz w:val="18"/>
+                <w:szCs w:val="18"/>
                 <w:lang w:val="en-US"/>
               </w:rPr>
               <w:t>Dear {CLIENT_NAME}}, thank you for the opportunity to provide our services for your events. We look forward to sharing our services with you and your guests. Booking staff, planning and directing an event can be stressful. Therefore, we promise to do everything we can to ease the burden on you.</w:t>
@@ -720,8 +720,8 @@
               <w:spacing w:after="0" w:line="0" w:lineRule="atLeast"/>
               <w:rPr>
                 <w:rFonts w:ascii="Open Sans" w:hAnsi="Open Sans" w:cs="Open Sans"/>
-                <w:sz w:val="20"/>
-                <w:szCs w:val="20"/>
+                <w:sz w:val="18"/>
+                <w:szCs w:val="18"/>
                 <w:lang w:val="en-US"/>
               </w:rPr>
             </w:pPr>
@@ -734,16 +734,16 @@
               <w:rPr>
                 <w:rFonts w:ascii="Open Sans" w:eastAsiaTheme="minorEastAsia" w:hAnsi="Open Sans" w:cs="Open Sans"/>
                 <w:color w:val="323232"/>
-                <w:sz w:val="20"/>
-                <w:szCs w:val="20"/>
+                <w:sz w:val="18"/>
+                <w:szCs w:val="18"/>
               </w:rPr>
             </w:pPr>
             <w:r>
               <w:rPr>
                 <w:rFonts w:ascii="Open Sans" w:eastAsiaTheme="minorEastAsia" w:hAnsi="Open Sans" w:cs="Open Sans"/>
                 <w:color w:val="323232"/>
-                <w:sz w:val="20"/>
-                <w:szCs w:val="20"/>
+                <w:sz w:val="18"/>
+                <w:szCs w:val="18"/>
               </w:rPr>
               <w:t>We have taken all your concerns and requests into consideration as we developed this proposal and quote. We would like to assure you that our wait staff, catering and event services will meet your high food standards and suit your personal tastes.</w:t>
             </w:r>
@@ -755,8 +755,8 @@
               <w:rPr>
                 <w:rFonts w:ascii="Open Sans" w:eastAsiaTheme="minorEastAsia" w:hAnsi="Open Sans" w:cs="Open Sans"/>
                 <w:color w:val="323232"/>
-                <w:sz w:val="20"/>
-                <w:szCs w:val="20"/>
+                <w:sz w:val="18"/>
+                <w:szCs w:val="18"/>
               </w:rPr>
             </w:pPr>
           </w:p>
@@ -768,16 +768,16 @@
               <w:rPr>
                 <w:rFonts w:ascii="Open Sans" w:eastAsiaTheme="minorEastAsia" w:hAnsi="Open Sans" w:cs="Open Sans"/>
                 <w:color w:val="323232"/>
-                <w:sz w:val="20"/>
-                <w:szCs w:val="20"/>
+                <w:sz w:val="18"/>
+                <w:szCs w:val="18"/>
               </w:rPr>
             </w:pPr>
             <w:r>
               <w:rPr>
                 <w:rFonts w:ascii="Open Sans" w:eastAsiaTheme="minorEastAsia" w:hAnsi="Open Sans" w:cs="Open Sans"/>
                 <w:color w:val="323232"/>
-                <w:sz w:val="20"/>
-                <w:szCs w:val="20"/>
+                <w:sz w:val="18"/>
+                <w:szCs w:val="18"/>
               </w:rPr>
               <w:t>In this proposal, we have only included the services that you have selected. Please feel free to notify us if you have any concerns or additional services that you would like to request. We hope that you will find this proposal to your liking. We are looking forward to helping provide all your guests with an enjoyable and unforgettable experience.</w:t>
             </w:r>
@@ -790,16 +790,16 @@
               <w:rPr>
                 <w:rFonts w:ascii="Open Sans" w:eastAsiaTheme="minorEastAsia" w:hAnsi="Open Sans" w:cs="Open Sans"/>
                 <w:color w:val="323232"/>
-                <w:sz w:val="20"/>
-                <w:szCs w:val="20"/>
+                <w:sz w:val="18"/>
+                <w:szCs w:val="18"/>
               </w:rPr>
             </w:pPr>
             <w:r>
               <w:rPr>
                 <w:rFonts w:ascii="Open Sans" w:eastAsiaTheme="minorEastAsia" w:hAnsi="Open Sans" w:cs="Open Sans"/>
                 <w:color w:val="323232"/>
-                <w:sz w:val="20"/>
-                <w:szCs w:val="20"/>
+                <w:sz w:val="18"/>
+                <w:szCs w:val="18"/>
               </w:rPr>
               <w:t>Sincerely.</w:t>
             </w:r>
@@ -812,8 +812,8 @@
               <w:rPr>
                 <w:rFonts w:ascii="Open Sans" w:eastAsiaTheme="minorEastAsia" w:hAnsi="Open Sans" w:cs="Open Sans"/>
                 <w:color w:val="323232"/>
-                <w:sz w:val="20"/>
-                <w:szCs w:val="20"/>
+                <w:sz w:val="18"/>
+                <w:szCs w:val="18"/>
               </w:rPr>
             </w:pPr>
           </w:p>
@@ -825,8 +825,8 @@
               <w:rPr>
                 <w:rFonts w:ascii="Open Sans" w:eastAsiaTheme="minorEastAsia" w:hAnsi="Open Sans" w:cs="Open Sans"/>
                 <w:color w:val="323232"/>
-                <w:sz w:val="20"/>
-                <w:szCs w:val="20"/>
+                <w:sz w:val="18"/>
+                <w:szCs w:val="18"/>
               </w:rPr>
             </w:pPr>
           </w:p>
@@ -837,16 +837,16 @@
               <w:rPr>
                 <w:rFonts w:ascii="Open Sans" w:eastAsiaTheme="minorEastAsia" w:hAnsi="Open Sans" w:cs="Open Sans"/>
                 <w:color w:val="323232"/>
-                <w:sz w:val="20"/>
-                <w:szCs w:val="20"/>
+                <w:sz w:val="18"/>
+                <w:szCs w:val="18"/>
               </w:rPr>
             </w:pPr>
             <w:r>
               <w:rPr>
                 <w:rFonts w:ascii="Open Sans" w:eastAsiaTheme="minorEastAsia" w:hAnsi="Open Sans" w:cs="Open Sans"/>
                 <w:color w:val="323232"/>
-                <w:sz w:val="20"/>
-                <w:szCs w:val="20"/>
+                <w:sz w:val="18"/>
+                <w:szCs w:val="18"/>
               </w:rPr>
               <w:t>____________________________________</w:t>
             </w:r>
@@ -867,8 +867,8 @@
               <w:rPr>
                 <w:rFonts w:ascii="Open Sans" w:eastAsiaTheme="minorEastAsia" w:hAnsi="Open Sans" w:cs="Open Sans"/>
                 <w:color w:val="323232"/>
-                <w:sz w:val="20"/>
-                <w:szCs w:val="20"/>
+                <w:sz w:val="18"/>
+                <w:szCs w:val="18"/>
                 <w:lang w:val="en-US"/>
               </w:rPr>
               <w:t>Foodesign</w:t>
@@ -878,21 +878,11 @@
               <w:rPr>
                 <w:rFonts w:ascii="Open Sans" w:eastAsiaTheme="minorEastAsia" w:hAnsi="Open Sans" w:cs="Open Sans"/>
                 <w:color w:val="323232"/>
-                <w:sz w:val="20"/>
-                <w:szCs w:val="20"/>
-                <w:lang w:val="en-US"/>
-              </w:rPr>
-              <w:t xml:space="preserve"> Conceptual Event</w:t>
-            </w:r>
-            <w:r>
-              <w:rPr>
-                <w:rFonts w:ascii="Open Sans" w:eastAsiaTheme="minorEastAsia" w:hAnsi="Open Sans" w:cs="Open Sans"/>
-                <w:color w:val="323232"/>
-                <w:sz w:val="22"/>
-                <w:szCs w:val="22"/>
-                <w:lang w:val="en-US"/>
-              </w:rPr>
-              <w:t>.</w:t>
+                <w:sz w:val="18"/>
+                <w:szCs w:val="18"/>
+                <w:lang w:val="en-US"/>
+              </w:rPr>
+              <w:t xml:space="preserve"> Conceptual Event.</w:t>
             </w:r>
           </w:p>
         </w:tc>
@@ -959,18 +949,18 @@
     <w:tbl>
       <w:tblPr>
         <w:tblStyle w:val="Tablaconcuadrcula"/>
-        <w:tblW w:w="9720" w:type="dxa"/>
+        <w:tblW w:w="5000" w:type="pct"/>
         <w:tblLayout w:type="fixed"/>
         <w:tblLook w:val="04A0" w:firstRow="1" w:lastRow="0" w:firstColumn="1" w:lastColumn="0" w:noHBand="0" w:noVBand="1"/>
       </w:tblPr>
       <w:tblGrid>
-        <w:gridCol w:w="2970"/>
-        <w:gridCol w:w="6750"/>
+        <w:gridCol w:w="2206"/>
+        <w:gridCol w:w="5512"/>
       </w:tblGrid>
       <w:tr>
         <w:tc>
           <w:tcPr>
-            <w:tcW w:w="2970" w:type="dxa"/>
+            <w:tcW w:w="1429" w:type="pct"/>
             <w:tcBorders>
               <w:top w:val="nil"/>
               <w:left w:val="nil"/>
@@ -1367,7 +1357,7 @@
         </w:tc>
         <w:tc>
           <w:tcPr>
-            <w:tcW w:w="6749" w:type="dxa"/>
+            <w:tcW w:w="3571" w:type="pct"/>
             <w:tcBorders>
               <w:top w:val="nil"/>
               <w:left w:val="nil"/>
@@ -1382,8 +1372,8 @@
                 <w:rFonts w:ascii="Open Sans" w:hAnsi="Open Sans" w:cs="Open Sans"/>
                 <w:b/>
                 <w:color w:val="612D4B"/>
-                <w:sz w:val="20"/>
-                <w:szCs w:val="20"/>
+                <w:sz w:val="16"/>
+                <w:szCs w:val="16"/>
                 <w:lang w:val="en-US"/>
               </w:rPr>
             </w:pPr>
@@ -1392,8 +1382,8 @@
                 <w:rFonts w:ascii="Open Sans" w:eastAsia="Aptos" w:hAnsi="Open Sans" w:cs="Open Sans"/>
                 <w:b/>
                 <w:color w:val="612D4B"/>
-                <w:sz w:val="20"/>
-                <w:szCs w:val="20"/>
+                <w:sz w:val="16"/>
+                <w:szCs w:val="16"/>
                 <w:lang w:val="en-US"/>
               </w:rPr>
               <w:t>Explanation of Fees</w:t>
@@ -1406,8 +1396,8 @@
                 <w:rFonts w:ascii="Open Sans" w:hAnsi="Open Sans" w:cs="Open Sans"/>
                 <w:b/>
                 <w:color w:val="612D4B"/>
-                <w:sz w:val="20"/>
-                <w:szCs w:val="20"/>
+                <w:sz w:val="16"/>
+                <w:szCs w:val="16"/>
                 <w:lang w:val="en-US"/>
               </w:rPr>
             </w:pPr>
@@ -1419,8 +1409,8 @@
                 <w:rFonts w:ascii="Open Sans" w:hAnsi="Open Sans" w:cs="Open Sans"/>
                 <w:b/>
                 <w:bCs/>
-                <w:sz w:val="18"/>
-                <w:szCs w:val="18"/>
+                <w:sz w:val="16"/>
+                <w:szCs w:val="16"/>
                 <w:lang w:val="en-US"/>
               </w:rPr>
             </w:pPr>
@@ -1429,8 +1419,8 @@
                 <w:rFonts w:ascii="Open Sans" w:eastAsia="Aptos" w:hAnsi="Open Sans" w:cs="Open Sans"/>
                 <w:b/>
                 <w:bCs/>
-                <w:sz w:val="18"/>
-                <w:szCs w:val="18"/>
+                <w:sz w:val="16"/>
+                <w:szCs w:val="16"/>
                 <w:lang w:val="en-US"/>
               </w:rPr>
               <w:t>Event Planning Service</w:t>
@@ -1442,16 +1432,16 @@
               <w:jc w:val="both"/>
               <w:rPr>
                 <w:rFonts w:ascii="Open Sans" w:hAnsi="Open Sans" w:cs="Open Sans"/>
-                <w:sz w:val="18"/>
-                <w:szCs w:val="18"/>
-                <w:lang w:val="en-US"/>
-              </w:rPr>
-            </w:pPr>
-            <w:r>
-              <w:rPr>
-                <w:rFonts w:ascii="Open Sans" w:eastAsia="Aptos" w:hAnsi="Open Sans" w:cs="Open Sans"/>
-                <w:sz w:val="18"/>
-                <w:szCs w:val="18"/>
+                <w:sz w:val="16"/>
+                <w:szCs w:val="16"/>
+                <w:lang w:val="en-US"/>
+              </w:rPr>
+            </w:pPr>
+            <w:r>
+              <w:rPr>
+                <w:rFonts w:ascii="Open Sans" w:eastAsia="Aptos" w:hAnsi="Open Sans" w:cs="Open Sans"/>
+                <w:sz w:val="16"/>
+                <w:szCs w:val="16"/>
                 <w:lang w:val="en-US"/>
               </w:rPr>
               <w:t xml:space="preserve">If a client </w:t>
@@ -1460,8 +1450,8 @@
             <w:r>
               <w:rPr>
                 <w:rFonts w:ascii="Open Sans" w:eastAsia="Aptos" w:hAnsi="Open Sans" w:cs="Open Sans"/>
-                <w:sz w:val="18"/>
-                <w:szCs w:val="18"/>
+                <w:sz w:val="16"/>
+                <w:szCs w:val="16"/>
                 <w:lang w:val="en-US"/>
               </w:rPr>
               <w:t>resquets</w:t>
@@ -1470,8 +1460,8 @@
             <w:r>
               <w:rPr>
                 <w:rFonts w:ascii="Open Sans" w:eastAsia="Aptos" w:hAnsi="Open Sans" w:cs="Open Sans"/>
-                <w:sz w:val="18"/>
-                <w:szCs w:val="18"/>
+                <w:sz w:val="16"/>
+                <w:szCs w:val="16"/>
                 <w:lang w:val="en-US"/>
               </w:rPr>
               <w:t xml:space="preserve"> that the caterer </w:t>
@@ -1480,8 +1470,8 @@
             <w:r>
               <w:rPr>
                 <w:rFonts w:ascii="Open Sans" w:eastAsia="Aptos" w:hAnsi="Open Sans" w:cs="Open Sans"/>
-                <w:sz w:val="18"/>
-                <w:szCs w:val="18"/>
+                <w:sz w:val="16"/>
+                <w:szCs w:val="16"/>
                 <w:lang w:val="en-US"/>
               </w:rPr>
               <w:t>coordinate</w:t>
@@ -1490,8 +1480,8 @@
             <w:r>
               <w:rPr>
                 <w:rFonts w:ascii="Open Sans" w:eastAsia="Aptos" w:hAnsi="Open Sans" w:cs="Open Sans"/>
-                <w:sz w:val="18"/>
-                <w:szCs w:val="18"/>
+                <w:sz w:val="16"/>
+                <w:szCs w:val="16"/>
                 <w:lang w:val="en-US"/>
               </w:rPr>
               <w:t xml:space="preserve"> the venue rental &amp; décor, entertainment, photography, valet parking, flower arranging, or other aspects of planning the event, there will be a small fee charged for this service to account for the labor needed to plan the event as agreed upon in writing by the parties at the time of such request.</w:t>
@@ -1504,8 +1494,8 @@
                 <w:rFonts w:ascii="Open Sans" w:hAnsi="Open Sans" w:cs="Open Sans"/>
                 <w:b/>
                 <w:bCs/>
-                <w:sz w:val="18"/>
-                <w:szCs w:val="18"/>
+                <w:sz w:val="16"/>
+                <w:szCs w:val="16"/>
                 <w:lang w:val="en-US"/>
               </w:rPr>
             </w:pPr>
@@ -1517,8 +1507,8 @@
                 <w:rFonts w:ascii="Open Sans" w:hAnsi="Open Sans" w:cs="Open Sans"/>
                 <w:b/>
                 <w:bCs/>
-                <w:sz w:val="18"/>
-                <w:szCs w:val="18"/>
+                <w:sz w:val="16"/>
+                <w:szCs w:val="16"/>
                 <w:lang w:val="en-US"/>
               </w:rPr>
             </w:pPr>
@@ -1527,8 +1517,8 @@
                 <w:rFonts w:ascii="Open Sans" w:eastAsia="Aptos" w:hAnsi="Open Sans" w:cs="Open Sans"/>
                 <w:b/>
                 <w:bCs/>
-                <w:sz w:val="18"/>
-                <w:szCs w:val="18"/>
+                <w:sz w:val="16"/>
+                <w:szCs w:val="16"/>
                 <w:lang w:val="en-US"/>
               </w:rPr>
               <w:t>Delivery Fee</w:t>
@@ -1545,16 +1535,16 @@
               <w:ind w:left="290"/>
               <w:rPr>
                 <w:rFonts w:ascii="Open Sans" w:hAnsi="Open Sans" w:cs="Open Sans"/>
-                <w:sz w:val="18"/>
-                <w:szCs w:val="18"/>
-                <w:lang w:val="en-US"/>
-              </w:rPr>
-            </w:pPr>
-            <w:r>
-              <w:rPr>
-                <w:rFonts w:ascii="Open Sans" w:eastAsia="Aptos" w:hAnsi="Open Sans" w:cs="Open Sans"/>
-                <w:sz w:val="18"/>
-                <w:szCs w:val="18"/>
+                <w:sz w:val="16"/>
+                <w:szCs w:val="16"/>
+                <w:lang w:val="en-US"/>
+              </w:rPr>
+            </w:pPr>
+            <w:r>
+              <w:rPr>
+                <w:rFonts w:ascii="Open Sans" w:eastAsia="Aptos" w:hAnsi="Open Sans" w:cs="Open Sans"/>
+                <w:sz w:val="16"/>
+                <w:szCs w:val="16"/>
                 <w:lang w:val="en-US"/>
               </w:rPr>
               <w:t>Not Applicable.</w:t>
@@ -1571,16 +1561,16 @@
               <w:ind w:left="290"/>
               <w:rPr>
                 <w:rFonts w:ascii="Open Sans" w:hAnsi="Open Sans" w:cs="Open Sans"/>
-                <w:sz w:val="18"/>
-                <w:szCs w:val="18"/>
-                <w:lang w:val="en-US"/>
-              </w:rPr>
-            </w:pPr>
-            <w:r>
-              <w:rPr>
-                <w:rFonts w:ascii="Open Sans" w:eastAsia="Aptos" w:hAnsi="Open Sans" w:cs="Open Sans"/>
-                <w:sz w:val="18"/>
-                <w:szCs w:val="18"/>
+                <w:sz w:val="16"/>
+                <w:szCs w:val="16"/>
+                <w:lang w:val="en-US"/>
+              </w:rPr>
+            </w:pPr>
+            <w:r>
+              <w:rPr>
+                <w:rFonts w:ascii="Open Sans" w:eastAsia="Aptos" w:hAnsi="Open Sans" w:cs="Open Sans"/>
+                <w:sz w:val="16"/>
+                <w:szCs w:val="16"/>
                 <w:lang w:val="en-US"/>
               </w:rPr>
               <w:t>If the event takes place more than x miles from N/A, a fee of x$/mile will be added to the total costs to cover gas and vehicle mileage.</w:t>
@@ -1593,8 +1583,8 @@
                 <w:rFonts w:ascii="Open Sans" w:hAnsi="Open Sans" w:cs="Open Sans"/>
                 <w:b/>
                 <w:bCs/>
-                <w:sz w:val="18"/>
-                <w:szCs w:val="18"/>
+                <w:sz w:val="16"/>
+                <w:szCs w:val="16"/>
                 <w:lang w:val="en-US"/>
               </w:rPr>
             </w:pPr>
@@ -1606,8 +1596,8 @@
                 <w:rFonts w:ascii="Open Sans" w:hAnsi="Open Sans" w:cs="Open Sans"/>
                 <w:b/>
                 <w:bCs/>
-                <w:sz w:val="18"/>
-                <w:szCs w:val="18"/>
+                <w:sz w:val="16"/>
+                <w:szCs w:val="16"/>
                 <w:lang w:val="en-US"/>
               </w:rPr>
             </w:pPr>
@@ -1616,8 +1606,8 @@
                 <w:rFonts w:ascii="Open Sans" w:eastAsia="Aptos" w:hAnsi="Open Sans" w:cs="Open Sans"/>
                 <w:b/>
                 <w:bCs/>
-                <w:sz w:val="18"/>
-                <w:szCs w:val="18"/>
+                <w:sz w:val="16"/>
+                <w:szCs w:val="16"/>
                 <w:lang w:val="en-US"/>
               </w:rPr>
               <w:t>Service Charge</w:t>
@@ -1629,16 +1619,16 @@
               <w:jc w:val="both"/>
               <w:rPr>
                 <w:rFonts w:ascii="Open Sans" w:hAnsi="Open Sans" w:cs="Open Sans"/>
-                <w:sz w:val="18"/>
-                <w:szCs w:val="18"/>
-                <w:lang w:val="en-US"/>
-              </w:rPr>
-            </w:pPr>
-            <w:r>
-              <w:rPr>
-                <w:rFonts w:ascii="Open Sans" w:eastAsia="Aptos" w:hAnsi="Open Sans" w:cs="Open Sans"/>
-                <w:sz w:val="18"/>
-                <w:szCs w:val="18"/>
+                <w:sz w:val="16"/>
+                <w:szCs w:val="16"/>
+                <w:lang w:val="en-US"/>
+              </w:rPr>
+            </w:pPr>
+            <w:r>
+              <w:rPr>
+                <w:rFonts w:ascii="Open Sans" w:eastAsia="Aptos" w:hAnsi="Open Sans" w:cs="Open Sans"/>
+                <w:sz w:val="16"/>
+                <w:szCs w:val="16"/>
                 <w:lang w:val="en-US"/>
               </w:rPr>
               <w:t xml:space="preserve">A service charge of </w:t>
@@ -1648,8 +1638,8 @@
                 <w:rFonts w:ascii="Open Sans" w:eastAsia="Aptos" w:hAnsi="Open Sans" w:cs="Open Sans"/>
                 <w:b/>
                 <w:bCs/>
-                <w:sz w:val="18"/>
-                <w:szCs w:val="18"/>
+                <w:sz w:val="16"/>
+                <w:szCs w:val="16"/>
                 <w:lang w:val="en-US"/>
               </w:rPr>
               <w:t>{{SERVICE_CHARGE_RATE}}</w:t>
@@ -1657,8 +1647,8 @@
             <w:r>
               <w:rPr>
                 <w:rFonts w:ascii="Open Sans" w:eastAsia="Aptos" w:hAnsi="Open Sans" w:cs="Open Sans"/>
-                <w:sz w:val="18"/>
-                <w:szCs w:val="18"/>
+                <w:sz w:val="16"/>
+                <w:szCs w:val="16"/>
                 <w:lang w:val="en-US"/>
               </w:rPr>
               <w:t xml:space="preserve"> is Indicated in your proposal of service. This fee covers all administration, insurance fees, transportation, site visits, trucking, &amp; supplemental costs associated with the event planning.</w:t>
@@ -1671,8 +1661,8 @@
                 <w:rFonts w:ascii="Open Sans" w:hAnsi="Open Sans" w:cs="Open Sans"/>
                 <w:b/>
                 <w:bCs/>
-                <w:sz w:val="18"/>
-                <w:szCs w:val="18"/>
+                <w:sz w:val="16"/>
+                <w:szCs w:val="16"/>
                 <w:lang w:val="en-US"/>
               </w:rPr>
             </w:pPr>
@@ -1684,8 +1674,8 @@
                 <w:rFonts w:ascii="Open Sans" w:hAnsi="Open Sans" w:cs="Open Sans"/>
                 <w:b/>
                 <w:bCs/>
-                <w:sz w:val="18"/>
-                <w:szCs w:val="18"/>
+                <w:sz w:val="16"/>
+                <w:szCs w:val="16"/>
                 <w:lang w:val="en-US"/>
               </w:rPr>
             </w:pPr>
@@ -1694,8 +1684,8 @@
                 <w:rFonts w:ascii="Open Sans" w:eastAsia="Aptos" w:hAnsi="Open Sans" w:cs="Open Sans"/>
                 <w:b/>
                 <w:bCs/>
-                <w:sz w:val="18"/>
-                <w:szCs w:val="18"/>
+                <w:sz w:val="16"/>
+                <w:szCs w:val="16"/>
                 <w:lang w:val="en-US"/>
               </w:rPr>
               <w:t>Gratuities</w:t>
@@ -1707,16 +1697,16 @@
               <w:jc w:val="both"/>
               <w:rPr>
                 <w:rFonts w:ascii="Open Sans" w:hAnsi="Open Sans" w:cs="Open Sans"/>
-                <w:sz w:val="18"/>
-                <w:szCs w:val="18"/>
-                <w:lang w:val="en-US"/>
-              </w:rPr>
-            </w:pPr>
-            <w:r>
-              <w:rPr>
-                <w:rFonts w:ascii="Open Sans" w:eastAsia="Aptos" w:hAnsi="Open Sans" w:cs="Open Sans"/>
-                <w:sz w:val="18"/>
-                <w:szCs w:val="18"/>
+                <w:sz w:val="16"/>
+                <w:szCs w:val="16"/>
+                <w:lang w:val="en-US"/>
+              </w:rPr>
+            </w:pPr>
+            <w:r>
+              <w:rPr>
+                <w:rFonts w:ascii="Open Sans" w:eastAsia="Aptos" w:hAnsi="Open Sans" w:cs="Open Sans"/>
+                <w:sz w:val="16"/>
+                <w:szCs w:val="16"/>
                 <w:lang w:val="en-US"/>
               </w:rPr>
               <w:t>Gratuities are not included in the proposal and are at the sole discretion of the client.</w:t>
@@ -1729,8 +1719,8 @@
                 <w:rFonts w:ascii="Open Sans" w:hAnsi="Open Sans" w:cs="Open Sans"/>
                 <w:b/>
                 <w:bCs/>
-                <w:sz w:val="18"/>
-                <w:szCs w:val="18"/>
+                <w:sz w:val="16"/>
+                <w:szCs w:val="16"/>
                 <w:lang w:val="en-US"/>
               </w:rPr>
             </w:pPr>
@@ -1742,8 +1732,8 @@
                 <w:rFonts w:ascii="Open Sans" w:hAnsi="Open Sans" w:cs="Open Sans"/>
                 <w:b/>
                 <w:bCs/>
-                <w:sz w:val="18"/>
-                <w:szCs w:val="18"/>
+                <w:sz w:val="16"/>
+                <w:szCs w:val="16"/>
                 <w:lang w:val="en-US"/>
               </w:rPr>
             </w:pPr>
@@ -1752,8 +1742,8 @@
                 <w:rFonts w:ascii="Open Sans" w:eastAsia="Aptos" w:hAnsi="Open Sans" w:cs="Open Sans"/>
                 <w:b/>
                 <w:bCs/>
-                <w:sz w:val="18"/>
-                <w:szCs w:val="18"/>
+                <w:sz w:val="16"/>
+                <w:szCs w:val="16"/>
                 <w:lang w:val="en-US"/>
               </w:rPr>
               <w:t>Taxes and Insurance</w:t>
@@ -1764,16 +1754,16 @@
               <w:spacing w:after="0" w:line="0" w:lineRule="atLeast"/>
               <w:rPr>
                 <w:rFonts w:ascii="Open Sans" w:hAnsi="Open Sans" w:cs="Open Sans"/>
-                <w:sz w:val="18"/>
-                <w:szCs w:val="18"/>
-                <w:lang w:val="en-US"/>
-              </w:rPr>
-            </w:pPr>
-            <w:r>
-              <w:rPr>
-                <w:rFonts w:ascii="Open Sans" w:eastAsia="Aptos" w:hAnsi="Open Sans" w:cs="Open Sans"/>
-                <w:sz w:val="18"/>
-                <w:szCs w:val="18"/>
+                <w:sz w:val="16"/>
+                <w:szCs w:val="16"/>
+                <w:lang w:val="en-US"/>
+              </w:rPr>
+            </w:pPr>
+            <w:r>
+              <w:rPr>
+                <w:rFonts w:ascii="Open Sans" w:eastAsia="Aptos" w:hAnsi="Open Sans" w:cs="Open Sans"/>
+                <w:sz w:val="16"/>
+                <w:szCs w:val="16"/>
                 <w:lang w:val="en-US"/>
               </w:rPr>
               <w:t xml:space="preserve">All prices are subject to an </w:t>
@@ -1783,8 +1773,8 @@
                 <w:rFonts w:ascii="Open Sans" w:eastAsia="Aptos" w:hAnsi="Open Sans" w:cs="Open Sans"/>
                 <w:b/>
                 <w:bCs/>
-                <w:sz w:val="18"/>
-                <w:szCs w:val="18"/>
+                <w:sz w:val="16"/>
+                <w:szCs w:val="16"/>
                 <w:lang w:val="en-US"/>
               </w:rPr>
               <w:t>{{SERVICE_CHARGE_RATE}}</w:t>
@@ -1792,8 +1782,8 @@
             <w:r>
               <w:rPr>
                 <w:rFonts w:ascii="Open Sans" w:eastAsia="Aptos" w:hAnsi="Open Sans" w:cs="Open Sans"/>
-                <w:sz w:val="18"/>
-                <w:szCs w:val="18"/>
+                <w:sz w:val="16"/>
+                <w:szCs w:val="16"/>
                 <w:lang w:val="en-US"/>
               </w:rPr>
               <w:t xml:space="preserve"> service and {</w:t>
@@ -1803,8 +1793,8 @@
                 <w:rFonts w:ascii="Open Sans" w:eastAsia="Aptos" w:hAnsi="Open Sans" w:cs="Open Sans"/>
                 <w:b/>
                 <w:bCs/>
-                <w:sz w:val="18"/>
-                <w:szCs w:val="18"/>
+                <w:sz w:val="16"/>
+                <w:szCs w:val="16"/>
                 <w:lang w:val="en-US"/>
               </w:rPr>
               <w:t>{TAX_RATE}} {{TAX_NAME}}</w:t>
@@ -1812,8 +1802,8 @@
             <w:r>
               <w:rPr>
                 <w:rFonts w:ascii="Open Sans" w:eastAsia="Aptos" w:hAnsi="Open Sans" w:cs="Open Sans"/>
-                <w:sz w:val="18"/>
-                <w:szCs w:val="18"/>
+                <w:sz w:val="16"/>
+                <w:szCs w:val="16"/>
                 <w:lang w:val="en-US"/>
               </w:rPr>
               <w:t xml:space="preserve"> Sale Tax</w:t>
@@ -1826,8 +1816,8 @@
                 <w:rFonts w:ascii="Open Sans" w:hAnsi="Open Sans" w:cs="Open Sans"/>
                 <w:b/>
                 <w:bCs/>
-                <w:sz w:val="18"/>
-                <w:szCs w:val="18"/>
+                <w:sz w:val="16"/>
+                <w:szCs w:val="16"/>
                 <w:lang w:val="en-US"/>
               </w:rPr>
             </w:pPr>
@@ -1839,8 +1829,8 @@
                 <w:rFonts w:ascii="Open Sans" w:hAnsi="Open Sans" w:cs="Open Sans"/>
                 <w:b/>
                 <w:bCs/>
-                <w:sz w:val="18"/>
-                <w:szCs w:val="18"/>
+                <w:sz w:val="16"/>
+                <w:szCs w:val="16"/>
                 <w:lang w:val="en-US"/>
               </w:rPr>
             </w:pPr>
@@ -1849,8 +1839,8 @@
                 <w:rFonts w:ascii="Open Sans" w:eastAsia="Aptos" w:hAnsi="Open Sans" w:cs="Open Sans"/>
                 <w:b/>
                 <w:bCs/>
-                <w:sz w:val="18"/>
-                <w:szCs w:val="18"/>
+                <w:sz w:val="16"/>
+                <w:szCs w:val="16"/>
                 <w:lang w:val="en-US"/>
               </w:rPr>
               <w:t>Governing Terms</w:t>
@@ -1862,8 +1852,8 @@
               <w:jc w:val="both"/>
               <w:rPr>
                 <w:rFonts w:ascii="Open Sans" w:hAnsi="Open Sans" w:cs="Open Sans"/>
-                <w:sz w:val="18"/>
-                <w:szCs w:val="18"/>
+                <w:sz w:val="16"/>
+                <w:szCs w:val="16"/>
                 <w:lang w:val="en-US"/>
               </w:rPr>
             </w:pPr>
@@ -1871,8 +1861,8 @@
             <w:r>
               <w:rPr>
                 <w:rFonts w:ascii="Open Sans" w:eastAsia="Aptos" w:hAnsi="Open Sans" w:cs="Open Sans"/>
-                <w:sz w:val="18"/>
-                <w:szCs w:val="18"/>
+                <w:sz w:val="16"/>
+                <w:szCs w:val="16"/>
                 <w:lang w:val="en-US"/>
               </w:rPr>
               <w:t>Foodesign</w:t>
@@ -1881,8 +1871,8 @@
             <w:r>
               <w:rPr>
                 <w:rFonts w:ascii="Open Sans" w:eastAsia="Aptos" w:hAnsi="Open Sans" w:cs="Open Sans"/>
-                <w:sz w:val="18"/>
-                <w:szCs w:val="18"/>
+                <w:sz w:val="16"/>
+                <w:szCs w:val="16"/>
                 <w:lang w:val="en-US"/>
               </w:rPr>
               <w:t xml:space="preserve"> Conceptual Events and the Client acknowledge and agree that this proposal is governed by the Master Caterer Agreement executed between the parties.</w:t>
@@ -1895,8 +1885,8 @@
                 <w:rFonts w:ascii="Open Sans" w:hAnsi="Open Sans" w:cs="Open Sans"/>
                 <w:b/>
                 <w:bCs/>
-                <w:sz w:val="18"/>
-                <w:szCs w:val="18"/>
+                <w:sz w:val="16"/>
+                <w:szCs w:val="16"/>
                 <w:lang w:val="en-US"/>
               </w:rPr>
             </w:pPr>
@@ -1908,8 +1898,8 @@
                 <w:rFonts w:ascii="Open Sans" w:hAnsi="Open Sans" w:cs="Open Sans"/>
                 <w:b/>
                 <w:bCs/>
-                <w:sz w:val="18"/>
-                <w:szCs w:val="18"/>
+                <w:sz w:val="16"/>
+                <w:szCs w:val="16"/>
                 <w:lang w:val="en-US"/>
               </w:rPr>
             </w:pPr>
@@ -1918,8 +1908,8 @@
                 <w:rFonts w:ascii="Open Sans" w:eastAsia="Aptos" w:hAnsi="Open Sans" w:cs="Open Sans"/>
                 <w:b/>
                 <w:bCs/>
-                <w:sz w:val="18"/>
-                <w:szCs w:val="18"/>
+                <w:sz w:val="16"/>
+                <w:szCs w:val="16"/>
                 <w:lang w:val="en-US"/>
               </w:rPr>
               <w:t>Acceptance By Client</w:t>
@@ -1931,16 +1921,16 @@
               <w:jc w:val="both"/>
               <w:rPr>
                 <w:rFonts w:ascii="Open Sans" w:hAnsi="Open Sans" w:cs="Open Sans"/>
-                <w:sz w:val="18"/>
-                <w:szCs w:val="18"/>
-                <w:lang w:val="en-US"/>
-              </w:rPr>
-            </w:pPr>
-            <w:r>
-              <w:rPr>
-                <w:rFonts w:ascii="Open Sans" w:eastAsia="Aptos" w:hAnsi="Open Sans" w:cs="Open Sans"/>
-                <w:sz w:val="18"/>
-                <w:szCs w:val="18"/>
+                <w:sz w:val="16"/>
+                <w:szCs w:val="16"/>
+                <w:lang w:val="en-US"/>
+              </w:rPr>
+            </w:pPr>
+            <w:r>
+              <w:rPr>
+                <w:rFonts w:ascii="Open Sans" w:eastAsia="Aptos" w:hAnsi="Open Sans" w:cs="Open Sans"/>
+                <w:sz w:val="16"/>
+                <w:szCs w:val="16"/>
                 <w:lang w:val="en-US"/>
               </w:rPr>
               <w:t xml:space="preserve">The undersigned, as a duly authorized representative of the Client, {{CLIENT_NAME}}, hereby contract the services of </w:t>
@@ -1949,8 +1939,8 @@
             <w:r>
               <w:rPr>
                 <w:rFonts w:ascii="Open Sans" w:eastAsia="Aptos" w:hAnsi="Open Sans" w:cs="Open Sans"/>
-                <w:sz w:val="18"/>
-                <w:szCs w:val="18"/>
+                <w:sz w:val="16"/>
+                <w:szCs w:val="16"/>
                 <w:lang w:val="en-US"/>
               </w:rPr>
               <w:t>Foodesign</w:t>
@@ -1959,8 +1949,8 @@
             <w:r>
               <w:rPr>
                 <w:rFonts w:ascii="Open Sans" w:eastAsia="Aptos" w:hAnsi="Open Sans" w:cs="Open Sans"/>
-                <w:sz w:val="18"/>
-                <w:szCs w:val="18"/>
+                <w:sz w:val="16"/>
+                <w:szCs w:val="16"/>
                 <w:lang w:val="en-US"/>
               </w:rPr>
               <w:t xml:space="preserve"> Conceptual Events as listed and quoted in this proposal on behalf of the Client according to the terms and conditions herein.</w:t>
@@ -1974,8 +1964,8 @@
                 <w:rFonts w:ascii="Open Sans" w:hAnsi="Open Sans" w:cs="Open Sans"/>
                 <w:b/>
                 <w:bCs/>
-                <w:sz w:val="18"/>
-                <w:szCs w:val="18"/>
+                <w:sz w:val="16"/>
+                <w:szCs w:val="16"/>
                 <w:lang w:val="en-US"/>
               </w:rPr>
             </w:pPr>
@@ -1988,8 +1978,8 @@
                 <w:rFonts w:ascii="Open Sans" w:hAnsi="Open Sans" w:cs="Open Sans"/>
                 <w:b/>
                 <w:bCs/>
-                <w:sz w:val="18"/>
-                <w:szCs w:val="18"/>
+                <w:sz w:val="16"/>
+                <w:szCs w:val="16"/>
                 <w:lang w:val="en-US"/>
               </w:rPr>
             </w:pPr>
@@ -1999,8 +1989,8 @@
                 <w:rFonts w:ascii="Open Sans" w:eastAsia="Aptos" w:hAnsi="Open Sans" w:cs="Open Sans"/>
                 <w:b/>
                 <w:bCs/>
-                <w:sz w:val="18"/>
-                <w:szCs w:val="18"/>
+                <w:sz w:val="16"/>
+                <w:szCs w:val="16"/>
                 <w:lang w:val="en-US"/>
               </w:rPr>
               <w:t>Signed</w:t>
@@ -2008,8 +1998,8 @@
             <w:r>
               <w:rPr>
                 <w:rFonts w:ascii="Open Sans" w:eastAsia="Aptos" w:hAnsi="Open Sans" w:cs="Open Sans"/>
-                <w:sz w:val="18"/>
-                <w:szCs w:val="18"/>
+                <w:sz w:val="16"/>
+                <w:szCs w:val="16"/>
                 <w:lang w:val="en-US"/>
               </w:rPr>
               <w:t>:_</w:t>
@@ -2018,8 +2008,8 @@
             <w:r>
               <w:rPr>
                 <w:rFonts w:ascii="Open Sans" w:eastAsia="Aptos" w:hAnsi="Open Sans" w:cs="Open Sans"/>
-                <w:sz w:val="18"/>
-                <w:szCs w:val="18"/>
+                <w:sz w:val="16"/>
+                <w:szCs w:val="16"/>
                 <w:lang w:val="en-US"/>
               </w:rPr>
               <w:t>__________________________________</w:t>
@@ -2029,8 +2019,8 @@
                 <w:rFonts w:ascii="Open Sans" w:eastAsia="Aptos" w:hAnsi="Open Sans" w:cs="Open Sans"/>
                 <w:b/>
                 <w:bCs/>
-                <w:sz w:val="18"/>
-                <w:szCs w:val="18"/>
+                <w:sz w:val="16"/>
+                <w:szCs w:val="16"/>
                 <w:lang w:val="en-US"/>
               </w:rPr>
               <w:t xml:space="preserve"> </w:t>
@@ -2041,8 +2031,8 @@
                 <w:rFonts w:ascii="Open Sans" w:eastAsia="Aptos" w:hAnsi="Open Sans" w:cs="Open Sans"/>
                 <w:b/>
                 <w:bCs/>
-                <w:sz w:val="18"/>
-                <w:szCs w:val="18"/>
+                <w:sz w:val="16"/>
+                <w:szCs w:val="16"/>
                 <w:lang w:val="en-US"/>
               </w:rPr>
               <w:t>Name:_</w:t>
@@ -2053,8 +2043,8 @@
                 <w:rFonts w:ascii="Open Sans" w:eastAsia="Aptos" w:hAnsi="Open Sans" w:cs="Open Sans"/>
                 <w:b/>
                 <w:bCs/>
-                <w:sz w:val="18"/>
-                <w:szCs w:val="18"/>
+                <w:sz w:val="16"/>
+                <w:szCs w:val="16"/>
                 <w:lang w:val="en-US"/>
               </w:rPr>
               <w:t>___________________________________</w:t>
@@ -2066,8 +2056,8 @@
               <w:jc w:val="both"/>
               <w:rPr>
                 <w:rFonts w:ascii="Open Sans" w:hAnsi="Open Sans" w:cs="Open Sans"/>
-                <w:sz w:val="18"/>
-                <w:szCs w:val="18"/>
+                <w:sz w:val="16"/>
+                <w:szCs w:val="16"/>
                 <w:lang w:val="en-US"/>
               </w:rPr>
             </w:pPr>
@@ -2076,8 +2066,8 @@
                 <w:rFonts w:ascii="Open Sans" w:eastAsia="Aptos" w:hAnsi="Open Sans" w:cs="Open Sans"/>
                 <w:b/>
                 <w:bCs/>
-                <w:sz w:val="18"/>
-                <w:szCs w:val="18"/>
+                <w:sz w:val="16"/>
+                <w:szCs w:val="16"/>
                 <w:lang w:val="en-US"/>
               </w:rPr>
               <w:t>Data:</w:t>
@@ -2085,8 +2075,8 @@
             <w:r>
               <w:rPr>
                 <w:rFonts w:ascii="Open Sans" w:eastAsia="Aptos" w:hAnsi="Open Sans" w:cs="Open Sans"/>
-                <w:sz w:val="18"/>
-                <w:szCs w:val="18"/>
+                <w:sz w:val="16"/>
+                <w:szCs w:val="16"/>
                 <w:lang w:val="en-US"/>
               </w:rPr>
               <w:t xml:space="preserve"> _____________________________________</w:t>
@@ -2098,8 +2088,8 @@
               <w:jc w:val="both"/>
               <w:rPr>
                 <w:rFonts w:ascii="Open Sans" w:hAnsi="Open Sans" w:cs="Open Sans"/>
-                <w:sz w:val="18"/>
-                <w:szCs w:val="18"/>
+                <w:sz w:val="16"/>
+                <w:szCs w:val="16"/>
                 <w:lang w:val="en-US"/>
               </w:rPr>
             </w:pPr>
@@ -2110,8 +2100,8 @@
               <w:jc w:val="both"/>
               <w:rPr>
                 <w:rFonts w:ascii="Open Sans" w:hAnsi="Open Sans" w:cs="Open Sans"/>
-                <w:sz w:val="18"/>
-                <w:szCs w:val="18"/>
+                <w:sz w:val="16"/>
+                <w:szCs w:val="16"/>
                 <w:lang w:val="en-US"/>
               </w:rPr>
             </w:pPr>
@@ -2122,21 +2112,86 @@
               <w:jc w:val="both"/>
               <w:rPr>
                 <w:rFonts w:ascii="Open Sans" w:hAnsi="Open Sans" w:cs="Open Sans"/>
-                <w:sz w:val="18"/>
-                <w:szCs w:val="18"/>
-                <w:lang w:val="en-US"/>
-              </w:rPr>
-            </w:pPr>
-          </w:p>
-          <w:p>
-            <w:pPr>
-              <w:spacing w:after="0" w:line="0" w:lineRule="atLeast"/>
-              <w:rPr>
-                <w:rFonts w:ascii="Open Sans" w:hAnsi="Open Sans" w:cs="Open Sans"/>
+                <w:sz w:val="16"/>
+                <w:szCs w:val="16"/>
+                <w:lang w:val="en-US"/>
+              </w:rPr>
+            </w:pPr>
+          </w:p>
+          <w:p>
+            <w:pPr>
+              <w:spacing w:after="0" w:line="0" w:lineRule="atLeast"/>
+              <w:rPr>
+                <w:rFonts w:ascii="Open Sans" w:eastAsia="Aptos" w:hAnsi="Open Sans" w:cs="Open Sans"/>
                 <w:b/>
                 <w:bCs/>
-                <w:sz w:val="18"/>
-                <w:szCs w:val="18"/>
+                <w:sz w:val="16"/>
+                <w:szCs w:val="16"/>
+                <w:lang w:val="en-US"/>
+              </w:rPr>
+            </w:pPr>
+          </w:p>
+          <w:p>
+            <w:pPr>
+              <w:spacing w:after="0" w:line="0" w:lineRule="atLeast"/>
+              <w:rPr>
+                <w:rFonts w:ascii="Open Sans" w:eastAsia="Aptos" w:hAnsi="Open Sans" w:cs="Open Sans"/>
+                <w:b/>
+                <w:bCs/>
+                <w:sz w:val="16"/>
+                <w:szCs w:val="16"/>
+                <w:lang w:val="en-US"/>
+              </w:rPr>
+            </w:pPr>
+          </w:p>
+          <w:p>
+            <w:pPr>
+              <w:spacing w:after="0" w:line="0" w:lineRule="atLeast"/>
+              <w:rPr>
+                <w:rFonts w:ascii="Open Sans" w:eastAsia="Aptos" w:hAnsi="Open Sans" w:cs="Open Sans"/>
+                <w:b/>
+                <w:bCs/>
+                <w:sz w:val="16"/>
+                <w:szCs w:val="16"/>
+                <w:lang w:val="en-US"/>
+              </w:rPr>
+            </w:pPr>
+          </w:p>
+          <w:p>
+            <w:pPr>
+              <w:spacing w:after="0" w:line="0" w:lineRule="atLeast"/>
+              <w:rPr>
+                <w:rFonts w:ascii="Open Sans" w:eastAsia="Aptos" w:hAnsi="Open Sans" w:cs="Open Sans"/>
+                <w:b/>
+                <w:bCs/>
+                <w:sz w:val="16"/>
+                <w:szCs w:val="16"/>
+                <w:lang w:val="en-US"/>
+              </w:rPr>
+            </w:pPr>
+          </w:p>
+          <w:p>
+            <w:pPr>
+              <w:spacing w:after="0" w:line="0" w:lineRule="atLeast"/>
+              <w:rPr>
+                <w:rFonts w:ascii="Open Sans" w:eastAsia="Aptos" w:hAnsi="Open Sans" w:cs="Open Sans"/>
+                <w:b/>
+                <w:bCs/>
+                <w:sz w:val="16"/>
+                <w:szCs w:val="16"/>
+                <w:lang w:val="en-US"/>
+              </w:rPr>
+            </w:pPr>
+          </w:p>
+          <w:p>
+            <w:pPr>
+              <w:spacing w:after="0" w:line="0" w:lineRule="atLeast"/>
+              <w:rPr>
+                <w:rFonts w:ascii="Open Sans" w:hAnsi="Open Sans" w:cs="Open Sans"/>
+                <w:b/>
+                <w:bCs/>
+                <w:sz w:val="16"/>
+                <w:szCs w:val="16"/>
                 <w:lang w:val="en-US"/>
               </w:rPr>
             </w:pPr>
@@ -2146,8 +2201,8 @@
                 <w:rFonts w:ascii="Open Sans" w:eastAsia="Aptos" w:hAnsi="Open Sans" w:cs="Open Sans"/>
                 <w:b/>
                 <w:bCs/>
-                <w:sz w:val="18"/>
-                <w:szCs w:val="18"/>
+                <w:sz w:val="16"/>
+                <w:szCs w:val="16"/>
                 <w:lang w:val="en-US"/>
               </w:rPr>
               <w:lastRenderedPageBreak/>
@@ -2159,8 +2214,8 @@
                 <w:rFonts w:ascii="Open Sans" w:eastAsia="Aptos" w:hAnsi="Open Sans" w:cs="Open Sans"/>
                 <w:b/>
                 <w:bCs/>
-                <w:sz w:val="18"/>
-                <w:szCs w:val="18"/>
+                <w:sz w:val="16"/>
+                <w:szCs w:val="16"/>
                 <w:lang w:val="en-US"/>
               </w:rPr>
               <w:t xml:space="preserve"> Conceptual Events Policies</w:t>
@@ -2171,8 +2226,8 @@
               <w:spacing w:after="0" w:line="0" w:lineRule="atLeast"/>
               <w:rPr>
                 <w:rFonts w:ascii="Open Sans" w:hAnsi="Open Sans" w:cs="Open Sans"/>
-                <w:sz w:val="18"/>
-                <w:szCs w:val="18"/>
+                <w:sz w:val="16"/>
+                <w:szCs w:val="16"/>
                 <w:lang w:val="en-US"/>
               </w:rPr>
             </w:pPr>
@@ -2183,16 +2238,16 @@
               <w:jc w:val="both"/>
               <w:rPr>
                 <w:rFonts w:ascii="Open Sans" w:hAnsi="Open Sans" w:cs="Open Sans"/>
-                <w:sz w:val="18"/>
-                <w:szCs w:val="18"/>
-                <w:lang w:val="en-US"/>
-              </w:rPr>
-            </w:pPr>
-            <w:r>
-              <w:rPr>
-                <w:rFonts w:ascii="Open Sans" w:eastAsia="Aptos" w:hAnsi="Open Sans" w:cs="Open Sans"/>
-                <w:sz w:val="18"/>
-                <w:szCs w:val="18"/>
+                <w:sz w:val="16"/>
+                <w:szCs w:val="16"/>
+                <w:lang w:val="en-US"/>
+              </w:rPr>
+            </w:pPr>
+            <w:r>
+              <w:rPr>
+                <w:rFonts w:ascii="Open Sans" w:eastAsia="Aptos" w:hAnsi="Open Sans" w:cs="Open Sans"/>
+                <w:sz w:val="16"/>
+                <w:szCs w:val="16"/>
                 <w:lang w:val="en-US"/>
               </w:rPr>
               <w:t>The fees and pricing quoted in this proposal are estimates based on the client’s guaranteed minimum guest count and guaranteed time duration. If more guests are served or the caterer’s services are needed for additional time not included in the client’s estimated duration, the caterer reserves the right to charge a fair price for the additional food, drink, labor and services required. If fewer guests attend or less time is needed, the caterer will still be paid according to the guaranteed minimum guest count and time duration.</w:t>
@@ -2204,8 +2259,8 @@
               <w:jc w:val="both"/>
               <w:rPr>
                 <w:rFonts w:ascii="Open Sans" w:hAnsi="Open Sans" w:cs="Open Sans"/>
-                <w:sz w:val="18"/>
-                <w:szCs w:val="18"/>
+                <w:sz w:val="16"/>
+                <w:szCs w:val="16"/>
                 <w:lang w:val="en-US"/>
               </w:rPr>
             </w:pPr>
@@ -2218,8 +2273,8 @@
                 <w:rFonts w:ascii="Open Sans" w:hAnsi="Open Sans" w:cs="Open Sans"/>
                 <w:b/>
                 <w:bCs/>
-                <w:sz w:val="18"/>
-                <w:szCs w:val="18"/>
+                <w:sz w:val="16"/>
+                <w:szCs w:val="16"/>
                 <w:lang w:val="en-US"/>
               </w:rPr>
             </w:pPr>
@@ -2228,8 +2283,8 @@
                 <w:rFonts w:ascii="Open Sans" w:eastAsia="Aptos" w:hAnsi="Open Sans" w:cs="Open Sans"/>
                 <w:b/>
                 <w:bCs/>
-                <w:sz w:val="18"/>
-                <w:szCs w:val="18"/>
+                <w:sz w:val="16"/>
+                <w:szCs w:val="16"/>
                 <w:lang w:val="en-US"/>
               </w:rPr>
               <w:t>Deposit</w:t>
@@ -2241,16 +2296,16 @@
               <w:jc w:val="both"/>
               <w:rPr>
                 <w:rFonts w:ascii="Open Sans" w:hAnsi="Open Sans" w:cs="Open Sans"/>
-                <w:sz w:val="18"/>
-                <w:szCs w:val="18"/>
-                <w:lang w:val="en-US"/>
-              </w:rPr>
-            </w:pPr>
-            <w:r>
-              <w:rPr>
-                <w:rFonts w:ascii="Open Sans" w:eastAsia="Aptos" w:hAnsi="Open Sans" w:cs="Open Sans"/>
-                <w:sz w:val="18"/>
-                <w:szCs w:val="18"/>
+                <w:sz w:val="16"/>
+                <w:szCs w:val="16"/>
+                <w:lang w:val="en-US"/>
+              </w:rPr>
+            </w:pPr>
+            <w:r>
+              <w:rPr>
+                <w:rFonts w:ascii="Open Sans" w:eastAsia="Aptos" w:hAnsi="Open Sans" w:cs="Open Sans"/>
+                <w:sz w:val="16"/>
+                <w:szCs w:val="16"/>
                 <w:lang w:val="en-US"/>
               </w:rPr>
               <w:t>An initial deposit of 50% of the Final total costs is required to contract the caterer for the event. Upon cancellation of the caterer’s services within 31 days of the planned event date, a full refund of the deposit will be supplied. If the caterer’s services are canceled within 25 to 30 days of the event, 50% of the deposit will be refunded. If cancellation notice is given less than 25 days before the event, no refund of the deposit will be supplied.</w:t>
@@ -2262,8 +2317,8 @@
               <w:jc w:val="both"/>
               <w:rPr>
                 <w:rFonts w:ascii="Open Sans" w:hAnsi="Open Sans" w:cs="Open Sans"/>
-                <w:sz w:val="18"/>
-                <w:szCs w:val="18"/>
+                <w:sz w:val="16"/>
+                <w:szCs w:val="16"/>
                 <w:lang w:val="en-US"/>
               </w:rPr>
             </w:pPr>
@@ -2274,8 +2329,8 @@
               <w:jc w:val="both"/>
               <w:rPr>
                 <w:rFonts w:ascii="Open Sans" w:hAnsi="Open Sans" w:cs="Open Sans"/>
-                <w:sz w:val="18"/>
-                <w:szCs w:val="18"/>
+                <w:sz w:val="16"/>
+                <w:szCs w:val="16"/>
                 <w:lang w:val="en-US"/>
               </w:rPr>
             </w:pPr>
@@ -2284,8 +2339,8 @@
                 <w:rFonts w:ascii="Open Sans" w:eastAsia="Aptos" w:hAnsi="Open Sans" w:cs="Open Sans"/>
                 <w:b/>
                 <w:bCs/>
-                <w:sz w:val="18"/>
-                <w:szCs w:val="18"/>
+                <w:sz w:val="16"/>
+                <w:szCs w:val="16"/>
                 <w:lang w:val="en-US"/>
               </w:rPr>
               <w:t>Terms</w:t>
@@ -2297,16 +2352,16 @@
               <w:jc w:val="both"/>
               <w:rPr>
                 <w:rFonts w:ascii="Open Sans" w:hAnsi="Open Sans" w:cs="Open Sans"/>
-                <w:sz w:val="18"/>
-                <w:szCs w:val="18"/>
-                <w:lang w:val="en-US"/>
-              </w:rPr>
-            </w:pPr>
-            <w:r>
-              <w:rPr>
-                <w:rFonts w:ascii="Open Sans" w:eastAsia="Aptos" w:hAnsi="Open Sans" w:cs="Open Sans"/>
-                <w:sz w:val="18"/>
-                <w:szCs w:val="18"/>
+                <w:sz w:val="16"/>
+                <w:szCs w:val="16"/>
+                <w:lang w:val="en-US"/>
+              </w:rPr>
+            </w:pPr>
+            <w:r>
+              <w:rPr>
+                <w:rFonts w:ascii="Open Sans" w:eastAsia="Aptos" w:hAnsi="Open Sans" w:cs="Open Sans"/>
+                <w:sz w:val="16"/>
+                <w:szCs w:val="16"/>
                 <w:lang w:val="en-US"/>
               </w:rPr>
               <w:t>Terms for payment of the event are the following:</w:t>
@@ -2324,16 +2379,16 @@
               <w:jc w:val="both"/>
               <w:rPr>
                 <w:rFonts w:ascii="Open Sans" w:hAnsi="Open Sans" w:cs="Open Sans"/>
-                <w:sz w:val="18"/>
-                <w:szCs w:val="18"/>
-                <w:lang w:val="en-US"/>
-              </w:rPr>
-            </w:pPr>
-            <w:r>
-              <w:rPr>
-                <w:rFonts w:ascii="Open Sans" w:eastAsia="Aptos" w:hAnsi="Open Sans" w:cs="Open Sans"/>
-                <w:sz w:val="18"/>
-                <w:szCs w:val="18"/>
+                <w:sz w:val="16"/>
+                <w:szCs w:val="16"/>
+                <w:lang w:val="en-US"/>
+              </w:rPr>
+            </w:pPr>
+            <w:r>
+              <w:rPr>
+                <w:rFonts w:ascii="Open Sans" w:eastAsia="Aptos" w:hAnsi="Open Sans" w:cs="Open Sans"/>
+                <w:sz w:val="16"/>
+                <w:szCs w:val="16"/>
                 <w:lang w:val="en-US"/>
               </w:rPr>
               <w:t>The quoted Final cost, minus the deposit, must be paid a week before the event.</w:t>
@@ -2351,16 +2406,16 @@
               <w:jc w:val="both"/>
               <w:rPr>
                 <w:rFonts w:ascii="Open Sans" w:hAnsi="Open Sans" w:cs="Open Sans"/>
-                <w:sz w:val="18"/>
-                <w:szCs w:val="18"/>
-                <w:lang w:val="en-US"/>
-              </w:rPr>
-            </w:pPr>
-            <w:r>
-              <w:rPr>
-                <w:rFonts w:ascii="Open Sans" w:eastAsia="Aptos" w:hAnsi="Open Sans" w:cs="Open Sans"/>
-                <w:sz w:val="18"/>
-                <w:szCs w:val="18"/>
+                <w:sz w:val="16"/>
+                <w:szCs w:val="16"/>
+                <w:lang w:val="en-US"/>
+              </w:rPr>
+            </w:pPr>
+            <w:r>
+              <w:rPr>
+                <w:rFonts w:ascii="Open Sans" w:eastAsia="Aptos" w:hAnsi="Open Sans" w:cs="Open Sans"/>
+                <w:sz w:val="16"/>
+                <w:szCs w:val="16"/>
                 <w:lang w:val="en-US"/>
               </w:rPr>
               <w:t>Any added costs due to higher than minimum guaranteed guest counts, extra ser vices or additional duration of services will be billed to the client within 3 business days after the event and must be paid within 5 business days after the event.</w:t>
@@ -2378,16 +2433,16 @@
               <w:jc w:val="both"/>
               <w:rPr>
                 <w:rFonts w:ascii="Open Sans" w:hAnsi="Open Sans" w:cs="Open Sans"/>
-                <w:sz w:val="18"/>
-                <w:szCs w:val="18"/>
-                <w:lang w:val="en-US"/>
-              </w:rPr>
-            </w:pPr>
-            <w:r>
-              <w:rPr>
-                <w:rFonts w:ascii="Open Sans" w:eastAsia="Aptos" w:hAnsi="Open Sans" w:cs="Open Sans"/>
-                <w:sz w:val="18"/>
-                <w:szCs w:val="18"/>
+                <w:sz w:val="16"/>
+                <w:szCs w:val="16"/>
+                <w:lang w:val="en-US"/>
+              </w:rPr>
+            </w:pPr>
+            <w:r>
+              <w:rPr>
+                <w:rFonts w:ascii="Open Sans" w:eastAsia="Aptos" w:hAnsi="Open Sans" w:cs="Open Sans"/>
+                <w:sz w:val="16"/>
+                <w:szCs w:val="16"/>
                 <w:lang w:val="en-US"/>
               </w:rPr>
               <w:t>If payment is not received according to the terms of this contract, the caterer reserves the right to take legal action and charge a fair amount of interest on the billed amount.</w:t>
@@ -2405,8 +2460,8 @@
               <w:jc w:val="both"/>
               <w:rPr>
                 <w:rFonts w:ascii="Open Sans" w:hAnsi="Open Sans" w:cs="Open Sans"/>
-                <w:sz w:val="18"/>
-                <w:szCs w:val="18"/>
+                <w:sz w:val="16"/>
+                <w:szCs w:val="16"/>
                 <w:lang w:val="en-US"/>
               </w:rPr>
             </w:pPr>
@@ -2414,8 +2469,8 @@
             <w:r>
               <w:rPr>
                 <w:rFonts w:ascii="Open Sans" w:eastAsia="Aptos" w:hAnsi="Open Sans" w:cs="Open Sans"/>
-                <w:sz w:val="18"/>
-                <w:szCs w:val="18"/>
+                <w:sz w:val="16"/>
+                <w:szCs w:val="16"/>
                 <w:lang w:val="en-US"/>
               </w:rPr>
               <w:t>Foodesign</w:t>
@@ -2424,8 +2479,8 @@
             <w:r>
               <w:rPr>
                 <w:rFonts w:ascii="Open Sans" w:eastAsia="Aptos" w:hAnsi="Open Sans" w:cs="Open Sans"/>
-                <w:sz w:val="18"/>
-                <w:szCs w:val="18"/>
+                <w:sz w:val="16"/>
+                <w:szCs w:val="16"/>
                 <w:lang w:val="en-US"/>
               </w:rPr>
               <w:t xml:space="preserve"> Conceptual Events accept cash, MasterCard, Visa, Amex or Personal Checks as Payment Options. If Mastercard, Visa, or AMEX is the preferred payment method, a 3.8% credit card fee will be added to the total amount.</w:t>
@@ -2443,8 +2498,8 @@
               <w:jc w:val="both"/>
               <w:rPr>
                 <w:rFonts w:ascii="Open Sans" w:hAnsi="Open Sans" w:cs="Open Sans"/>
-                <w:sz w:val="18"/>
-                <w:szCs w:val="18"/>
+                <w:sz w:val="16"/>
+                <w:szCs w:val="16"/>
                 <w:lang w:val="en-US"/>
               </w:rPr>
             </w:pPr>
@@ -2452,8 +2507,8 @@
             <w:r>
               <w:rPr>
                 <w:rFonts w:ascii="Open Sans" w:eastAsia="Aptos" w:hAnsi="Open Sans" w:cs="Open Sans"/>
-                <w:sz w:val="18"/>
-                <w:szCs w:val="18"/>
+                <w:sz w:val="16"/>
+                <w:szCs w:val="16"/>
                 <w:lang w:val="en-US"/>
               </w:rPr>
               <w:t>Foodesign</w:t>
@@ -2462,8 +2517,8 @@
             <w:r>
               <w:rPr>
                 <w:rFonts w:ascii="Open Sans" w:eastAsia="Aptos" w:hAnsi="Open Sans" w:cs="Open Sans"/>
-                <w:sz w:val="18"/>
-                <w:szCs w:val="18"/>
+                <w:sz w:val="16"/>
+                <w:szCs w:val="16"/>
                 <w:lang w:val="en-US"/>
               </w:rPr>
               <w:t xml:space="preserve"> Conceptual Events, will not be liable for a failure to perform this contract due to delays, strikes, storms, accidents, venue accessibility, or other causes beyond its control</w:t>
@@ -2477,11 +2532,78 @@
               <w:jc w:val="both"/>
               <w:rPr>
                 <w:rFonts w:ascii="Open Sans" w:hAnsi="Open Sans" w:cs="Open Sans"/>
-                <w:sz w:val="18"/>
-                <w:szCs w:val="18"/>
-                <w:lang w:val="en-US"/>
-              </w:rPr>
-            </w:pPr>
+                <w:sz w:val="16"/>
+                <w:szCs w:val="16"/>
+                <w:lang w:val="en-US"/>
+              </w:rPr>
+            </w:pPr>
+          </w:p>
+          <w:p>
+            <w:pPr>
+              <w:pStyle w:val="Prrafodelista"/>
+              <w:spacing w:after="0" w:line="0" w:lineRule="atLeast"/>
+              <w:ind w:left="372"/>
+              <w:rPr>
+                <w:rFonts w:ascii="Open Sans" w:hAnsi="Open Sans" w:cs="Open Sans"/>
+                <w:sz w:val="16"/>
+                <w:szCs w:val="16"/>
+                <w:lang w:val="en-US"/>
+              </w:rPr>
+            </w:pPr>
+            <w:r>
+              <w:rPr>
+                <w:rFonts w:ascii="Open Sans" w:eastAsia="Aptos" w:hAnsi="Open Sans" w:cs="Open Sans"/>
+                <w:sz w:val="16"/>
+                <w:szCs w:val="16"/>
+                <w:lang w:val="en-US"/>
+              </w:rPr>
+              <w:t>I, ______________________, hereby contract the caterer’s services as listed and quoted in this proposal according to the terms and conditions</w:t>
+            </w:r>
+            <w:r>
+              <w:rPr>
+                <w:rFonts w:ascii="Open Sans" w:eastAsia="Aptos" w:hAnsi="Open Sans" w:cs="Open Sans"/>
+                <w:sz w:val="16"/>
+                <w:szCs w:val="16"/>
+                <w:lang w:val="en-US"/>
+              </w:rPr>
+              <w:t xml:space="preserve"> </w:t>
+            </w:r>
+            <w:r>
+              <w:rPr>
+                <w:rFonts w:ascii="Open Sans" w:eastAsia="Aptos" w:hAnsi="Open Sans" w:cs="Open Sans"/>
+                <w:sz w:val="16"/>
+                <w:szCs w:val="16"/>
+                <w:lang w:val="en-US"/>
+              </w:rPr>
+              <w:t>herein.</w:t>
+            </w:r>
+            <w:r>
+              <w:rPr>
+                <w:rFonts w:ascii="Open Sans" w:eastAsia="Aptos" w:hAnsi="Open Sans" w:cs="Open Sans"/>
+                <w:sz w:val="16"/>
+                <w:szCs w:val="16"/>
+                <w:lang w:val="en-US"/>
+              </w:rPr>
+              <w:br/>
+            </w:r>
+            <w:r>
+              <w:rPr>
+                <w:rFonts w:ascii="Open Sans" w:eastAsia="Aptos" w:hAnsi="Open Sans" w:cs="Open Sans"/>
+                <w:sz w:val="16"/>
+                <w:szCs w:val="16"/>
+                <w:lang w:val="en-US"/>
+              </w:rPr>
+              <w:br/>
+            </w:r>
+            <w:r>
+              <w:rPr>
+                <w:rFonts w:ascii="Open Sans" w:eastAsia="Aptos" w:hAnsi="Open Sans" w:cs="Open Sans"/>
+                <w:sz w:val="16"/>
+                <w:szCs w:val="16"/>
+                <w:lang w:val="en-US"/>
+              </w:rPr>
+              <w:t>__________________________________________</w:t>
+            </w:r>
           </w:p>
           <w:p>
             <w:pPr>
@@ -2490,67 +2612,17 @@
               <w:ind w:left="372"/>
               <w:jc w:val="both"/>
               <w:rPr>
-                <w:rFonts w:ascii="Open Sans" w:hAnsi="Open Sans" w:cs="Open Sans"/>
-                <w:sz w:val="18"/>
-                <w:szCs w:val="18"/>
-                <w:lang w:val="en-US"/>
-              </w:rPr>
-            </w:pPr>
-            <w:r>
-              <w:rPr>
-                <w:rFonts w:ascii="Open Sans" w:eastAsia="Aptos" w:hAnsi="Open Sans" w:cs="Open Sans"/>
-                <w:sz w:val="18"/>
-                <w:szCs w:val="18"/>
-                <w:lang w:val="en-US"/>
-              </w:rPr>
-              <w:t>I, ______________________, hereby contract the caterer’s services as listed and quoted in this proposal according to the terms and conditions herein.</w:t>
-            </w:r>
-            <w:r>
-              <w:rPr>
-                <w:rFonts w:ascii="Open Sans" w:eastAsia="Aptos" w:hAnsi="Open Sans" w:cs="Open Sans"/>
-                <w:sz w:val="18"/>
-                <w:szCs w:val="18"/>
-                <w:lang w:val="en-US"/>
-              </w:rPr>
-              <w:br/>
-            </w:r>
-            <w:r>
-              <w:rPr>
-                <w:rFonts w:ascii="Open Sans" w:eastAsia="Aptos" w:hAnsi="Open Sans" w:cs="Open Sans"/>
-                <w:sz w:val="18"/>
-                <w:szCs w:val="18"/>
-                <w:lang w:val="en-US"/>
-              </w:rPr>
-              <w:br/>
-            </w:r>
-            <w:r>
-              <w:rPr>
-                <w:rFonts w:ascii="Open Sans" w:eastAsia="Aptos" w:hAnsi="Open Sans" w:cs="Open Sans"/>
-                <w:sz w:val="18"/>
-                <w:szCs w:val="18"/>
-                <w:lang w:val="en-US"/>
-              </w:rPr>
-              <w:t>__________________________________________</w:t>
-            </w:r>
-          </w:p>
-          <w:p>
-            <w:pPr>
-              <w:pStyle w:val="Prrafodelista"/>
-              <w:spacing w:after="0" w:line="0" w:lineRule="atLeast"/>
-              <w:ind w:left="372"/>
-              <w:jc w:val="both"/>
-              <w:rPr>
-                <w:rFonts w:ascii="Open Sans" w:eastAsia="Aptos" w:hAnsi="Open Sans" w:cs="Open Sans"/>
-                <w:sz w:val="18"/>
-                <w:szCs w:val="18"/>
-                <w:lang w:val="en-US"/>
-              </w:rPr>
-            </w:pPr>
-            <w:r>
-              <w:rPr>
-                <w:rFonts w:ascii="Open Sans" w:eastAsia="Aptos" w:hAnsi="Open Sans" w:cs="Open Sans"/>
-                <w:sz w:val="18"/>
-                <w:szCs w:val="18"/>
+                <w:rFonts w:ascii="Open Sans" w:eastAsia="Aptos" w:hAnsi="Open Sans" w:cs="Open Sans"/>
+                <w:sz w:val="16"/>
+                <w:szCs w:val="16"/>
+                <w:lang w:val="en-US"/>
+              </w:rPr>
+            </w:pPr>
+            <w:r>
+              <w:rPr>
+                <w:rFonts w:ascii="Open Sans" w:eastAsia="Aptos" w:hAnsi="Open Sans" w:cs="Open Sans"/>
+                <w:sz w:val="16"/>
+                <w:szCs w:val="16"/>
                 <w:lang w:val="en-US"/>
               </w:rPr>
               <w:t>Client’s Signature &amp; Dat</w:t>
@@ -2574,8 +2646,8 @@
     <w:sectPr>
       <w:headerReference w:type="default" r:id="rId9"/>
       <w:footerReference w:type="default" r:id="rId10"/>
-      <w:pgSz w:w="12240" w:h="15840"/>
-      <w:pgMar w:top="2880" w:right="1440" w:bottom="1440" w:left="1440" w:header="576" w:footer="706" w:gutter="0"/>
+      <w:pgSz w:w="12240" w:h="15840" w:code="1"/>
+      <w:pgMar w:top="2880" w:right="2261" w:bottom="1123" w:left="2261" w:header="576" w:footer="706" w:gutter="0"/>
       <w:cols w:space="720"/>
       <w:formProt w:val="0"/>
       <w:titlePg/>

</xml_diff>